<commit_message>
chore: start filling in the SP1 report
</commit_message>
<xml_diff>
--- a/51IP Injenerija prykladnyh zastosunkiv/3/IP_KNT-116m_Onyshchenko_15_PR3.docx
+++ b/51IP Injenerija prykladnyh zastosunkiv/3/IP_KNT-116m_Onyshchenko_15_PR3.docx
@@ -149,15 +149,7 @@
       </w:pPr>
       <w:r>
         <w:rPr/>
-        <w:t>Тема «</w:t>
-      </w:r>
-      <w:r>
-        <w:rPr/>
-        <w:t>Обробка природної мови та текстової інформації</w:t>
-      </w:r>
-      <w:r>
-        <w:rPr/>
-        <w:t>»</w:t>
+        <w:t>Тема «Обробка природної мови та текстової інформації»</w:t>
       </w:r>
     </w:p>
     <w:p>
@@ -244,14 +236,7 @@
           <w:b/>
           <w:bCs/>
         </w:rPr>
-        <w:t xml:space="preserve">Виконав варіант </w:t>
-      </w:r>
-      <w:r>
-        <w:rPr>
-          <w:b/>
-          <w:bCs/>
-        </w:rPr>
-        <w:t>15</w:t>
+        <w:t>Виконав варіант 15</w:t>
       </w:r>
     </w:p>
     <w:p>
@@ -643,15 +628,7 @@
       </w:pPr>
       <w:r>
         <w:rPr/>
-        <w:t>3.1. Для створення програмного забезпечення обрати мову програмування та інші засоби розробки (програмні бібліотеки та ін.). Студент не обмежується у виборі мови програмування та інших засоб</w:t>
-      </w:r>
-      <w:r>
-        <w:rPr/>
-        <w:t>ів</w:t>
-      </w:r>
-      <w:r>
-        <w:rPr/>
-        <w:t xml:space="preserve"> розробки програмного забезпечення.</w:t>
+        <w:t>3.1. Для створення програмного забезпечення обрати мову програмування та інші засоби розробки (програмні бібліотеки та ін.). Студент не обмежується у виборі мови програмування та інших засобів розробки програмного забезпечення.</w:t>
       </w:r>
     </w:p>
     <w:p>
@@ -872,11 +849,7 @@
       </w:pPr>
       <w:r>
         <w:rPr/>
-        <w:t>Я</w:t>
-      </w:r>
-      <w:r>
-        <w:rPr/>
-        <w:t xml:space="preserve">кі завдання відносяться до обробки природної мови? </w:t>
+        <w:t xml:space="preserve">Які завдання відносяться до обробки природної мови? </w:t>
       </w:r>
     </w:p>
     <w:p>
@@ -1687,8 +1660,8 @@
       <w:lang w:val="en-US" w:eastAsia="uk-UA"/>
     </w:rPr>
   </w:style>
-  <w:style w:type="character" w:styleId="user">
-    <w:name w:val="Символ нумерації (user)"/>
+  <w:style w:type="character" w:styleId="Style12">
+    <w:name w:val="Символ нумерації"/>
     <w:qFormat/>
     <w:rPr/>
   </w:style>
@@ -1699,7 +1672,7 @@
       <w:u w:val="single"/>
     </w:rPr>
   </w:style>
-  <w:style w:type="paragraph" w:styleId="Style12">
+  <w:style w:type="paragraph" w:styleId="Style13">
     <w:name w:val="Заголовок"/>
     <w:basedOn w:val="Normal"/>
     <w:next w:val="BodyText"/>
@@ -1709,7 +1682,7 @@
       <w:spacing w:before="240" w:after="120"/>
     </w:pPr>
     <w:rPr>
-      <w:rFonts w:ascii="Liberation Sans" w:hAnsi="Liberation Sans" w:eastAsia="Microsoft YaHei" w:cs="Arial Unicode MS"/>
+      <w:rFonts w:ascii="Liberation Sans" w:hAnsi="Liberation Sans" w:eastAsia="Microsoft YaHei" w:cs="Lucida Sans"/>
       <w:sz w:val="28"/>
       <w:szCs w:val="28"/>
     </w:rPr>
@@ -1746,7 +1719,7 @@
       <w:szCs w:val="24"/>
     </w:rPr>
   </w:style>
-  <w:style w:type="paragraph" w:styleId="Style13">
+  <w:style w:type="paragraph" w:styleId="Style14">
     <w:name w:val="Покажчик"/>
     <w:basedOn w:val="Normal"/>
     <w:qFormat/>
@@ -1754,10 +1727,10 @@
       <w:suppressLineNumbers/>
     </w:pPr>
     <w:rPr>
-      <w:rFonts w:cs="Arial Unicode MS"/>
-    </w:rPr>
-  </w:style>
-  <w:style w:type="paragraph" w:styleId="user1">
+      <w:rFonts w:cs="Lucida Sans"/>
+    </w:rPr>
+  </w:style>
+  <w:style w:type="paragraph" w:styleId="user">
     <w:name w:val="Заголовок (user)"/>
     <w:basedOn w:val="Normal"/>
     <w:next w:val="BodyText"/>
@@ -1767,12 +1740,12 @@
       <w:spacing w:before="240" w:after="120"/>
     </w:pPr>
     <w:rPr>
-      <w:rFonts w:ascii="Liberation Sans" w:hAnsi="Liberation Sans" w:eastAsia="Microsoft YaHei" w:cs="Lucida Sans"/>
+      <w:rFonts w:ascii="Liberation Sans" w:hAnsi="Liberation Sans" w:eastAsia="Microsoft YaHei" w:cs="Arial Unicode MS"/>
       <w:sz w:val="28"/>
       <w:szCs w:val="28"/>
     </w:rPr>
   </w:style>
-  <w:style w:type="paragraph" w:styleId="user2">
+  <w:style w:type="paragraph" w:styleId="user1">
     <w:name w:val="Покажчик (user)"/>
     <w:basedOn w:val="Normal"/>
     <w:qFormat/>
@@ -1780,12 +1753,12 @@
       <w:suppressLineNumbers/>
     </w:pPr>
     <w:rPr>
-      <w:rFonts w:cs="Lucida Sans"/>
+      <w:rFonts w:cs="Arial Unicode MS"/>
     </w:rPr>
   </w:style>
   <w:style w:type="paragraph" w:styleId="IndexHeading">
     <w:name w:val="index heading"/>
-    <w:basedOn w:val="Style12"/>
+    <w:basedOn w:val="user"/>
     <w:pPr/>
     <w:rPr/>
   </w:style>
@@ -2061,8 +2034,8 @@
     </w:pPr>
     <w:rPr/>
   </w:style>
-  <w:style w:type="paragraph" w:styleId="user3">
-    <w:name w:val="Верхній і нижній колонтитули (user)"/>
+  <w:style w:type="paragraph" w:styleId="Style15">
+    <w:name w:val="Верхній і нижній колонтитули"/>
     <w:basedOn w:val="Normal"/>
     <w:qFormat/>
     <w:pPr>
@@ -2075,8 +2048,8 @@
     </w:pPr>
     <w:rPr/>
   </w:style>
-  <w:style w:type="paragraph" w:styleId="Style14">
-    <w:name w:val="Верхній і нижній колонтитули"/>
+  <w:style w:type="paragraph" w:styleId="user2">
+    <w:name w:val="Верхній і нижній колонтитули (user)"/>
     <w:basedOn w:val="Normal"/>
     <w:qFormat/>
     <w:pPr/>
@@ -2084,14 +2057,14 @@
   </w:style>
   <w:style w:type="paragraph" w:styleId="Header">
     <w:name w:val="header"/>
-    <w:basedOn w:val="user3"/>
+    <w:basedOn w:val="Style15"/>
     <w:pPr>
       <w:suppressLineNumbers/>
     </w:pPr>
     <w:rPr/>
   </w:style>
-  <w:style w:type="paragraph" w:styleId="Style15">
-    <w:name w:val="Горизонтальна лінія"/>
+  <w:style w:type="paragraph" w:styleId="user3">
+    <w:name w:val="Горизонтальна лінія (user)"/>
     <w:basedOn w:val="Normal"/>
     <w:next w:val="BodyText"/>
     <w:qFormat/>
@@ -2107,8 +2080,16 @@
       <w:szCs w:val="12"/>
     </w:rPr>
   </w:style>
-  <w:style w:type="numbering" w:styleId="Style16" w:default="1">
-    <w:name w:val="Без маркерів"/>
+  <w:style w:type="paragraph" w:styleId="Footer">
+    <w:name w:val="footer"/>
+    <w:basedOn w:val="Style15"/>
+    <w:pPr>
+      <w:suppressLineNumbers/>
+    </w:pPr>
+    <w:rPr/>
+  </w:style>
+  <w:style w:type="numbering" w:styleId="user4" w:default="1">
+    <w:name w:val="Без маркерів (user)"/>
     <w:uiPriority w:val="99"/>
     <w:semiHidden/>
     <w:unhideWhenUsed/>

</xml_diff>